<commit_message>
No errors, just need to clean up the silkscreen. ready for a review
</commit_message>
<xml_diff>
--- a/PIM_V02/PIM_V02_Design_Notes.docx
+++ b/PIM_V02/PIM_V02_Design_Notes.docx
@@ -468,6 +468,7 @@
         <w:t xml:space="preserve">Inductor placement. moving the inductor to the top side was only meant to help layout better. but if </w:t>
       </w:r>
       <w:proofErr w:type="spellStart"/>
+      <w:proofErr w:type="gramStart"/>
       <w:r>
         <w:rPr>
           <w:b/>
@@ -476,6 +477,7 @@
         <w:t>its</w:t>
       </w:r>
       <w:proofErr w:type="spellEnd"/>
+      <w:proofErr w:type="gramEnd"/>
       <w:r>
         <w:rPr>
           <w:b/>
@@ -933,47 +935,118 @@
     </w:p>
     <w:p>
       <w:pPr>
-        <w:rPr>
-          <w:b/>
-          <w:bCs/>
-        </w:rPr>
-      </w:pPr>
-    </w:p>
-    <w:p>
-      <w:pPr>
-        <w:rPr>
-          <w:b/>
-          <w:bCs/>
-        </w:rPr>
-      </w:pPr>
-    </w:p>
-    <w:p>
-      <w:pPr>
-        <w:rPr>
-          <w:b/>
-          <w:bCs/>
-        </w:rPr>
-      </w:pPr>
-    </w:p>
-    <w:p>
-      <w:pPr>
-        <w:rPr>
-          <w:b/>
-          <w:bCs/>
-        </w:rPr>
-      </w:pPr>
-    </w:p>
-    <w:p>
-      <w:pPr>
-        <w:rPr>
-          <w:b/>
-          <w:bCs/>
-        </w:rPr>
-      </w:pPr>
-    </w:p>
-    <w:p>
-      <w:r>
-        <w:lastRenderedPageBreak/>
+        <w:pStyle w:val="Heading2"/>
+      </w:pPr>
+      <w:r>
+        <w:t>Power Circuit</w:t>
+      </w:r>
+    </w:p>
+    <w:p>
+      <w:r>
+        <w:t xml:space="preserve">Inductor selection, updates to not protrude as much. </w:t>
+      </w:r>
+    </w:p>
+    <w:p>
+      <w:r>
+        <w:t>Aiming for 1.5mm height.</w:t>
+      </w:r>
+    </w:p>
+    <w:p>
+      <w:pPr>
+        <w:pStyle w:val="ListParagraph"/>
+        <w:numPr>
+          <w:ilvl w:val="0"/>
+          <w:numId w:val="1"/>
+        </w:numPr>
+      </w:pPr>
+      <w:r>
+        <w:t xml:space="preserve">Replaced all Ls w </w:t>
+      </w:r>
+      <w:r>
+        <w:t>SRP5015TA-2R2M</w:t>
+      </w:r>
+      <w:r>
+        <w:t xml:space="preserve">. </w:t>
+      </w:r>
+    </w:p>
+    <w:p>
+      <w:pPr>
+        <w:pStyle w:val="ListParagraph"/>
+        <w:numPr>
+          <w:ilvl w:val="0"/>
+          <w:numId w:val="1"/>
+        </w:numPr>
+      </w:pPr>
+      <w:r>
+        <w:t>Fit 0R on all RT (</w:t>
+      </w:r>
+      <w:proofErr w:type="spellStart"/>
+      <w:r>
+        <w:t>inc</w:t>
+      </w:r>
+      <w:proofErr w:type="spellEnd"/>
+      <w:r>
+        <w:t xml:space="preserve"> </w:t>
+      </w:r>
+      <w:proofErr w:type="spellStart"/>
+      <w:r>
+        <w:t>freq</w:t>
+      </w:r>
+      <w:proofErr w:type="spellEnd"/>
+      <w:r>
+        <w:t xml:space="preserve">). </w:t>
+      </w:r>
+    </w:p>
+    <w:p>
+      <w:pPr>
+        <w:rPr>
+          <w:b/>
+          <w:bCs/>
+        </w:rPr>
+      </w:pPr>
+    </w:p>
+    <w:p>
+      <w:pPr>
+        <w:rPr>
+          <w:b/>
+          <w:bCs/>
+        </w:rPr>
+      </w:pPr>
+    </w:p>
+    <w:p>
+      <w:pPr>
+        <w:rPr>
+          <w:b/>
+          <w:bCs/>
+        </w:rPr>
+      </w:pPr>
+    </w:p>
+    <w:p>
+      <w:pPr>
+        <w:rPr>
+          <w:b/>
+          <w:bCs/>
+        </w:rPr>
+      </w:pPr>
+    </w:p>
+    <w:p>
+      <w:pPr>
+        <w:rPr>
+          <w:b/>
+          <w:bCs/>
+        </w:rPr>
+      </w:pPr>
+    </w:p>
+    <w:p>
+      <w:pPr>
+        <w:rPr>
+          <w:b/>
+          <w:bCs/>
+        </w:rPr>
+      </w:pPr>
+    </w:p>
+    <w:p>
+      <w:r>
         <w:t xml:space="preserve">23-SEP-26. KP. </w:t>
       </w:r>
     </w:p>
@@ -1741,7 +1814,6 @@
     <w:next w:val="Normal"/>
     <w:link w:val="Heading2Char"/>
     <w:uiPriority w:val="9"/>
-    <w:semiHidden/>
     <w:unhideWhenUsed/>
     <w:qFormat/>
     <w:rsid w:val="00226A3F"/>
@@ -1958,7 +2030,6 @@
     <w:basedOn w:val="DefaultParagraphFont"/>
     <w:link w:val="Heading2"/>
     <w:uiPriority w:val="9"/>
-    <w:semiHidden/>
     <w:rsid w:val="00226A3F"/>
     <w:rPr>
       <w:rFonts w:asciiTheme="majorHAnsi" w:eastAsiaTheme="majorEastAsia" w:hAnsiTheme="majorHAnsi" w:cstheme="majorBidi"/>

</xml_diff>